<commit_message>
docs: align handoff docs with current release
</commit_message>
<xml_diff>
--- a/docs/基于千问的股票筛选系统设计与实现.docx
+++ b/docs/基于千问的股票筛选系统设计与实现.docx
@@ -1282,7 +1282,7 @@
           <w:b w:val="0"/>
           <w:sz w:val="24"/>
         </w:rPr>
-        <w:t>FR-10 增删自选：登录用户可对自选股进行增删，支持备注；</w:t>
+        <w:t>FR-10 增删自选：登录用户可对自选股进行增删，支持加入价、加入日期和预警规则同步；</w:t>
       </w:r>
     </w:p>
     <w:p>
@@ -1297,7 +1297,22 @@
           <w:b w:val="0"/>
           <w:sz w:val="24"/>
         </w:rPr>
-        <w:t>FR-11 自选列表：按时间倒序展示用户的全部自选股。</w:t>
+        <w:t>FR-11 自选列表：支持按加入日期、涨跌幅、估值、行业等字段排序，并支持批量编辑；</w:t>
+      </w:r>
+    </w:p>
+    <w:p>
+      <w:pPr>
+        <w:pStyle w:val="ListBullet"/>
+        <w:spacing w:lineRule="auto" w:line="360"/>
+        <w:ind w:left="360" w:firstLine="0"/>
+      </w:pPr>
+      <w:r>
+        <w:rPr>
+          <w:rFonts w:ascii="Times New Roman" w:hAnsi="Times New Roman" w:eastAsia="宋体"/>
+          <w:b w:val="0"/>
+          <w:sz w:val="24"/>
+        </w:rPr>
+        <w:t>FR-12 预警规则：支持价格突破、价格跌破、累计涨跌幅、日内涨跌幅等规则，并可批量启用、暂停或删除。</w:t>
       </w:r>
     </w:p>
     <w:p>
@@ -6821,7 +6836,7 @@
                 <w:b w:val="0"/>
                 <w:sz w:val="21"/>
               </w:rPr>
-              <w:t>用户与股票的多对多关系（带备注）</w:t>
+              <w:t>用户与股票的多对多关系（带加入价、预警规则）</w:t>
             </w:r>
           </w:p>
         </w:tc>
@@ -12047,7 +12062,7 @@
                 <w:b w:val="0"/>
                 <w:sz w:val="21"/>
               </w:rPr>
-              <w:t>用户备注</w:t>
+              <w:t>用户备注（兼容字段）</w:t>
             </w:r>
           </w:p>
         </w:tc>
@@ -16626,7 +16641,7 @@
           <w:b w:val="0"/>
           <w:sz w:val="24"/>
         </w:rPr>
-        <w:t>qwen_client.parse_nl_query 内部优先调用 OpenAI 兼容的 Responses API（支持 reasoning effort 与 JSON 模式），失败时自动回退到 chat.completions；解析阶段使用正则在文本中提取 ``{...}`` 片段后再 json.loads，保证模型偶发返回带 Markdown 代码块时仍能正常解析。</w:t>
+        <w:t>当前自然语言选股采用 bounded ReAct：模型只输出 final 或白名单工具 action，后端执行通过 schema 校验的工具。OpenAI-compatible 网关使用 Chat Completions 路径，Responses API 默认关闭；模型超时或不可达时安全停止，不会把本地兜底伪装成 AI 筛选。</w:t>
       </w:r>
     </w:p>
     <w:p>
@@ -16759,7 +16774,7 @@
           <w:b w:val="0"/>
           <w:sz w:val="24"/>
         </w:rPr>
-        <w:t>前端使用 Vue 3 单文件组件 + Pinia 状态管理 + Vue Router 4 客户端路由，按业务划分为 7 个核心视图：Dashboard（首页）、Chat（千问对话筛选）、Results（因子筛选结果）、Detail（股票详情）、Portfolio（自选）、Strategy（策略回测占位）、Login。axios 实例统一注入 JWT，并在响应拦截器中处理 401 → 自动跳转登录页。</w:t>
+        <w:t>前端使用 Vue 3 单文件组件 + Pinia 状态管理 + Vue Router 4 客户端路由，按业务划分为 7 个核心视图：Dashboard（首页）、Chat（千问对话筛选）、Results（因子筛选结果）、Detail（股票详情）、Portfolio（自选）、Strategy（条件筛选与策略选股）、Login。axios 实例统一注入 JWT，并在响应拦截器中处理 401 → 自动跳转登录页。</w:t>
       </w:r>
     </w:p>
     <w:p>
@@ -16946,7 +16961,7 @@
                 <w:b w:val="0"/>
                 <w:sz w:val="21"/>
               </w:rPr>
-              <w:t>行情概览、跑马灯、热门板块</w:t>
+              <w:t>6 个宽基指数、市场概况、板块与异动榜，首屏聚合接口加载</w:t>
             </w:r>
           </w:p>
         </w:tc>
@@ -17026,7 +17041,7 @@
                 <w:b w:val="0"/>
                 <w:sz w:val="21"/>
               </w:rPr>
-              <w:t>用户输入自然语言 → 千问解析 → 展示回显条件</w:t>
+              <w:t>用户输入自然语言 → Agent 选择工具或普通回复 → SSE 展示结果</w:t>
             </w:r>
           </w:p>
         </w:tc>
@@ -17266,7 +17281,7 @@
                 <w:b w:val="0"/>
                 <w:sz w:val="21"/>
               </w:rPr>
-              <w:t>自选增删 + 备注 + 实时估值</w:t>
+              <w:t>自选排序 + 批量编辑 + 预警启停/删除</w:t>
             </w:r>
           </w:p>
         </w:tc>
@@ -17346,7 +17361,7 @@
                 <w:b w:val="0"/>
                 <w:sz w:val="21"/>
               </w:rPr>
-              <w:t>策略回测占位（后续 Roadmap）</w:t>
+              <w:t>条件筛选、保存条件策略、6 个内置日线策略</w:t>
             </w:r>
           </w:p>
         </w:tc>
@@ -18284,9 +18299,9 @@
         <w:br/>
         <w:t xml:space="preserve">  ┌─────────────────────────┐</w:t>
         <w:br/>
-        <w:t xml:space="preserve">  │  调用 OpenAI Responses  │── 失败 ──► 回退 chat.completions</w:t>
+        <w:t xml:space="preserve">  │  调用 Chat Completions  │── 超时/不可达 ──► 安全停止</w:t>
         <w:br/>
-        <w:t xml:space="preserve">  │  (json_object 模式)     │</w:t>
+        <w:t xml:space="preserve">  │  (action/final schema) │</w:t>
         <w:br/>
         <w:t xml:space="preserve">  └─────────────┬───────────┘</w:t>
         <w:br/>
@@ -24590,7 +24605,7 @@
           <w:b w:val="0"/>
           <w:sz w:val="24"/>
         </w:rPr>
-        <w:t>Portfolio 页面对应登录用户的私域，要求用户登录后访问。表格形式展示用户的全部自选股，每一行包含代码、名称、现价、当日涨跌幅、加入日期、备注与「移除」按钮；列头支持点击排序；右上角「添加」按钮触发模态框，可通过搜索接口选择股票并填写备注。</w:t>
+        <w:t>Portfolio 页面对应登录用户的私域，要求用户登录后访问。表格形式展示用户的全部自选股，每一行包含代码、名称、现价、当日涨跌幅、加入日期、估值指标和预警入口；页面支持按加入日期、涨跌幅、估值、行业等字段排序，并支持批量移出自选、批量启用/暂停/删除预警规则。</w:t>
       </w:r>
     </w:p>
     <w:p>

</xml_diff>

<commit_message>
docs: use explicit bank screener example
</commit_message>
<xml_diff>
--- a/docs/基于千问的股票筛选系统设计与实现.docx
+++ b/docs/基于千问的股票筛选系统设计与实现.docx
@@ -11237,7 +11237,7 @@
                 <w:b w:val="0"/>
                 <w:sz w:val="21"/>
               </w:rPr>
-              <w:t>低估值高分红的银行股</w:t>
+              <w:t>银行股，PE低于15，PB低于1.2，股息率高于3%</w:t>
             </w:r>
           </w:p>
         </w:tc>
@@ -11263,7 +11263,7 @@
                 <w:b w:val="0"/>
                 <w:sz w:val="21"/>
               </w:rPr>
-              <w:t>生成 PE、股息率、行业等结构化条件并执行筛选。</w:t>
+              <w:t>生成行业、PE、PB、股息率等结构化条件并执行筛选。</w:t>
             </w:r>
           </w:p>
         </w:tc>

</xml_diff>